<commit_message>
add docs Blog_001_Inside Black Hole, Outside Big Bang/BÀI BLOG_Bên trong Black Hole, bên ngoài Big Bang_vi.docx
</commit_message>
<xml_diff>
--- a/Blogs/Blog_001_Inside Black Hole, Outside Big Bang/BÀI BLOG_Bên trong Black Hole, bên ngoài Big Bang_vi.docx
+++ b/Blogs/Blog_001_Inside Black Hole, Outside Big Bang/BÀI BLOG_Bên trong Black Hole, bên ngoài Big Bang_vi.docx
@@ -55,6 +55,74 @@
         </w:rPr>
         <w:t>Bên trong Black Hole, bên ngoài Big Ban</w:t>
       </w:r>
+    </w:p>
+    <w:p>
+      <w:pPr>
+        <w:rPr>
+          <w:rFonts w:hint="default"/>
+        </w:rPr>
+      </w:pPr>
+    </w:p>
+    <w:p>
+      <w:pPr>
+        <w:rPr>
+          <w:rFonts w:hint="default" w:ascii="Palatino Linotype" w:hAnsi="Palatino Linotype" w:cs="Palatino Linotype"/>
+          <w:sz w:val="24"/>
+          <w:szCs w:val="24"/>
+          <w:lang w:val="en-US"/>
+        </w:rPr>
+      </w:pPr>
+      <w:r>
+        <w:rPr>
+          <w:rFonts w:hint="default" w:ascii="Palatino Linotype" w:hAnsi="Palatino Linotype" w:cs="Palatino Linotype"/>
+          <w:sz w:val="24"/>
+          <w:szCs w:val="24"/>
+          <w:lang w:val="en-US"/>
+        </w:rPr>
+        <w:t xml:space="preserve">Tác giả: </w:t>
+      </w:r>
+      <w:r>
+        <w:rPr>
+          <w:rFonts w:hint="default" w:ascii="Palatino Linotype" w:hAnsi="Palatino Linotype" w:cs="Palatino Linotype"/>
+          <w:b/>
+          <w:bCs/>
+          <w:sz w:val="24"/>
+          <w:szCs w:val="24"/>
+          <w:lang w:val="en-US"/>
+        </w:rPr>
+        <w:t>Aiden Lee</w:t>
+      </w:r>
+      <w:r>
+        <w:rPr>
+          <w:rFonts w:hint="default" w:ascii="Palatino Linotype" w:hAnsi="Palatino Linotype" w:cs="Palatino Linotype"/>
+          <w:b w:val="0"/>
+          <w:bCs w:val="0"/>
+          <w:sz w:val="24"/>
+          <w:szCs w:val="24"/>
+          <w:lang w:val="en-US"/>
+        </w:rPr>
+        <w:t>, Sáng lập viên của THE LIVES MEDIA</w:t>
+      </w:r>
+      <w:bookmarkStart w:id="0" w:name="_GoBack"/>
+      <w:bookmarkEnd w:id="0"/>
+      <w:r>
+        <w:rPr>
+          <w:rFonts w:hint="default" w:ascii="Palatino Linotype" w:hAnsi="Palatino Linotype" w:cs="Palatino Linotype"/>
+          <w:b/>
+          <w:bCs/>
+          <w:sz w:val="24"/>
+          <w:szCs w:val="24"/>
+          <w:lang w:val="en-US"/>
+        </w:rPr>
+        <w:t xml:space="preserve"> </w:t>
+      </w:r>
+    </w:p>
+    <w:p>
+      <w:pPr>
+        <w:rPr>
+          <w:rFonts w:hint="default"/>
+        </w:rPr>
+      </w:pPr>
     </w:p>
     <w:p>
       <w:pPr>
@@ -3756,62 +3824,9 @@
           <w:rFonts w:hint="default" w:ascii="Palatino Linotype" w:hAnsi="Palatino Linotype" w:cs="Palatino Linotype"/>
           <w:sz w:val="24"/>
           <w:szCs w:val="24"/>
-        </w:rPr>
-      </w:pPr>
-    </w:p>
-    <w:p>
-      <w:pPr>
-        <w:rPr>
-          <w:rFonts w:hint="default" w:ascii="Palatino Linotype" w:hAnsi="Palatino Linotype" w:cs="Palatino Linotype"/>
-          <w:sz w:val="24"/>
-          <w:szCs w:val="24"/>
           <w:lang w:val="en-US"/>
         </w:rPr>
       </w:pPr>
-      <w:r>
-        <w:rPr>
-          <w:rFonts w:hint="default" w:ascii="Palatino Linotype" w:hAnsi="Palatino Linotype" w:cs="Palatino Linotype"/>
-          <w:sz w:val="24"/>
-          <w:szCs w:val="24"/>
-          <w:lang w:val="en-US"/>
-        </w:rPr>
-        <w:t xml:space="preserve">Tác giả: </w:t>
-      </w:r>
-      <w:r>
-        <w:rPr>
-          <w:rFonts w:hint="default" w:ascii="Palatino Linotype" w:hAnsi="Palatino Linotype" w:cs="Palatino Linotype"/>
-          <w:b/>
-          <w:bCs/>
-          <w:sz w:val="24"/>
-          <w:szCs w:val="24"/>
-          <w:lang w:val="en-US"/>
-        </w:rPr>
-        <w:t>Aiden Lee</w:t>
-      </w:r>
-      <w:r>
-        <w:rPr>
-          <w:rFonts w:hint="default" w:ascii="Palatino Linotype" w:hAnsi="Palatino Linotype" w:cs="Palatino Linotype"/>
-          <w:b w:val="0"/>
-          <w:bCs w:val="0"/>
-          <w:sz w:val="24"/>
-          <w:szCs w:val="24"/>
-          <w:lang w:val="en-US"/>
-        </w:rPr>
-        <w:t>, thelivesmedia.com</w:t>
-      </w:r>
-      <w:r>
-        <w:rPr>
-          <w:rFonts w:hint="default" w:ascii="Palatino Linotype" w:hAnsi="Palatino Linotype" w:cs="Palatino Linotype"/>
-          <w:b/>
-          <w:bCs/>
-          <w:sz w:val="24"/>
-          <w:szCs w:val="24"/>
-          <w:lang w:val="en-US"/>
-        </w:rPr>
-        <w:t xml:space="preserve"> </w:t>
-      </w:r>
-      <w:bookmarkStart w:id="0" w:name="_GoBack"/>
-      <w:bookmarkEnd w:id="0"/>
     </w:p>
     <w:sectPr>
       <w:pgSz w:w="11906" w:h="16838"/>
@@ -4000,7 +4015,7 @@
     <w:lsdException w:unhideWhenUsed="0" w:uiPriority="0" w:semiHidden="0" w:name="Document Map"/>
     <w:lsdException w:unhideWhenUsed="0" w:uiPriority="0" w:semiHidden="0" w:name="Plain Text"/>
     <w:lsdException w:unhideWhenUsed="0" w:uiPriority="0" w:semiHidden="0" w:name="E-mail Signature"/>
-    <w:lsdException w:unhideWhenUsed="0" w:uiPriority="0" w:semiHidden="0" w:name="Normal (Web)"/>
+    <w:lsdException w:qFormat="1" w:unhideWhenUsed="0" w:uiPriority="0" w:semiHidden="0" w:name="Normal (Web)"/>
     <w:lsdException w:unhideWhenUsed="0" w:uiPriority="0" w:semiHidden="0" w:name="HTML Acronym"/>
     <w:lsdException w:unhideWhenUsed="0" w:uiPriority="0" w:semiHidden="0" w:name="HTML Address"/>
     <w:lsdException w:unhideWhenUsed="0" w:uiPriority="0" w:semiHidden="0" w:name="HTML Cite"/>
@@ -4250,6 +4265,7 @@
   <w:style w:type="paragraph" w:styleId="7">
     <w:name w:val="Normal (Web)"/>
     <w:basedOn w:val="1"/>
+    <w:qFormat/>
     <w:uiPriority w:val="0"/>
     <w:rPr>
       <w:sz w:val="24"/>

</xml_diff>